<commit_message>
Add enunciado.docx and update plantilla.docx
Add new enunciado.docx and apply updates to plantilla.docx (binary changes). This commit adds the assignment/specification document and revises the existing template; no source code changes are included.
</commit_message>
<xml_diff>
--- a/plantilla.docx
+++ b/plantilla.docx
@@ -197,7 +197,7 @@
           <w:sz w:val="52"/>
           <w:szCs w:val="28"/>
         </w:rPr>
-        <w:t>Título del Trabajo Fin de Estudios</w:t>
+        <w:t>Sistema experto para la toma de decisiones estratégicas en League Of Legends</w:t>
       </w:r>
     </w:p>
     <w:p>
@@ -509,8 +509,14 @@
         <w:br w:type="page"/>
       </w:r>
       <w:r>
+        <w:rPr>
+          <w:highlight w:val="magenta"/>
+        </w:rPr>
         <w:lastRenderedPageBreak/>
-        <w:t xml:space="preserve">Resumen </w:t>
+        <w:t>Resumen</w:t>
+      </w:r>
+      <w:r>
+        <w:t xml:space="preserve"> </w:t>
       </w:r>
     </w:p>
     <w:p>
@@ -630,6 +636,9 @@
         <w:pStyle w:val="Ttulondices"/>
       </w:pPr>
       <w:r>
+        <w:rPr>
+          <w:highlight w:val="magenta"/>
+        </w:rPr>
         <w:lastRenderedPageBreak/>
         <w:t>Abstract</w:t>
       </w:r>
@@ -2723,24 +2732,39 @@
     <w:p>
       <w:pPr>
         <w:pStyle w:val="Ttulo1"/>
+        <w:rPr>
+          <w:highlight w:val="magenta"/>
+        </w:rPr>
       </w:pPr>
       <w:bookmarkStart w:id="1" w:name="_Toc437515557"/>
       <w:bookmarkStart w:id="2" w:name="_Toc14106979"/>
       <w:bookmarkStart w:id="3" w:name="_Toc149554656"/>
       <w:r>
+        <w:rPr>
+          <w:highlight w:val="magenta"/>
+        </w:rPr>
         <w:lastRenderedPageBreak/>
         <w:t>I</w:t>
       </w:r>
       <w:r>
+        <w:rPr>
+          <w:highlight w:val="magenta"/>
+        </w:rPr>
         <w:t>n</w:t>
       </w:r>
       <w:bookmarkEnd w:id="1"/>
       <w:bookmarkEnd w:id="2"/>
       <w:r>
+        <w:rPr>
+          <w:highlight w:val="magenta"/>
+        </w:rPr>
         <w:t>troducción</w:t>
       </w:r>
       <w:bookmarkEnd w:id="3"/>
       <w:r>
+        <w:rPr>
+          <w:highlight w:val="magenta"/>
+        </w:rPr>
         <w:t xml:space="preserve"> </w:t>
       </w:r>
     </w:p>
@@ -4163,9 +4187,15 @@
     <w:p>
       <w:pPr>
         <w:pStyle w:val="Ttulo1"/>
+        <w:rPr>
+          <w:highlight w:val="magenta"/>
+        </w:rPr>
       </w:pPr>
       <w:bookmarkStart w:id="11" w:name="_Toc149554660"/>
       <w:r>
+        <w:rPr>
+          <w:highlight w:val="magenta"/>
+        </w:rPr>
         <w:lastRenderedPageBreak/>
         <w:t>Contexto y Estado del Arte</w:t>
       </w:r>
@@ -4321,9 +4351,15 @@
     <w:p>
       <w:pPr>
         <w:pStyle w:val="Ttulo1"/>
+        <w:rPr>
+          <w:highlight w:val="magenta"/>
+        </w:rPr>
       </w:pPr>
       <w:bookmarkStart w:id="16" w:name="_Toc149554665"/>
       <w:r>
+        <w:rPr>
+          <w:highlight w:val="magenta"/>
+        </w:rPr>
         <w:lastRenderedPageBreak/>
         <w:t>Objetivos y metodología de trabajo</w:t>
       </w:r>
@@ -4395,9 +4431,15 @@
     <w:p>
       <w:pPr>
         <w:pStyle w:val="Ttulo1"/>
+        <w:rPr>
+          <w:highlight w:val="magenta"/>
+        </w:rPr>
       </w:pPr>
       <w:bookmarkStart w:id="20" w:name="_Toc149554669"/>
       <w:r>
+        <w:rPr>
+          <w:highlight w:val="magenta"/>
+        </w:rPr>
         <w:lastRenderedPageBreak/>
         <w:t>Título del capítulo</w:t>
       </w:r>
@@ -4434,9 +4476,15 @@
     <w:p>
       <w:pPr>
         <w:pStyle w:val="Ttulo1"/>
+        <w:rPr>
+          <w:highlight w:val="magenta"/>
+        </w:rPr>
       </w:pPr>
       <w:bookmarkStart w:id="21" w:name="_Toc149554670"/>
       <w:r>
+        <w:rPr>
+          <w:highlight w:val="magenta"/>
+        </w:rPr>
         <w:lastRenderedPageBreak/>
         <w:t>Conclusiones y trabajo futuro</w:t>
       </w:r>
@@ -4549,6 +4597,9 @@
       </w:pPr>
       <w:bookmarkStart w:id="24" w:name="_Toc149554673"/>
       <w:r>
+        <w:rPr>
+          <w:highlight w:val="magenta"/>
+        </w:rPr>
         <w:lastRenderedPageBreak/>
         <w:t>Referencias bibliográficas</w:t>
       </w:r>
@@ -4677,9 +4728,15 @@
     <w:p>
       <w:pPr>
         <w:pStyle w:val="Anexo"/>
+        <w:rPr>
+          <w:highlight w:val="magenta"/>
+        </w:rPr>
       </w:pPr>
       <w:bookmarkStart w:id="25" w:name="_Toc149554674"/>
       <w:r>
+        <w:rPr>
+          <w:highlight w:val="magenta"/>
+        </w:rPr>
         <w:lastRenderedPageBreak/>
         <w:t>Título del anexo.</w:t>
       </w:r>
@@ -4722,6 +4779,9 @@
       </w:pPr>
       <w:bookmarkStart w:id="26" w:name="_Toc149554675"/>
       <w:r>
+        <w:rPr>
+          <w:highlight w:val="magenta"/>
+        </w:rPr>
         <w:lastRenderedPageBreak/>
         <w:t>Índice de acrónimos</w:t>
       </w:r>
@@ -8776,12 +8836,15 @@
 </file>
 
 <file path=customXml/item2.xml><?xml version="1.0" encoding="utf-8"?>
-<?mso-contentType ?>
-<FormTemplates xmlns="http://schemas.microsoft.com/sharepoint/v3/contenttype/forms">
-  <Display>DocumentLibraryForm</Display>
-  <Edit>DocumentLibraryForm</Edit>
-  <New>DocumentLibraryForm</New>
-</FormTemplates>
+<p:properties xmlns:p="http://schemas.microsoft.com/office/2006/metadata/properties" xmlns:xsi="http://www.w3.org/2001/XMLSchema-instance" xmlns:pc="http://schemas.microsoft.com/office/infopath/2007/PartnerControls">
+  <documentManagement>
+    <TaxCatchAll xmlns="0a70e875-3d35-4be2-921f-7117c31bab9b" xsi:nil="true"/>
+    <lcf76f155ced4ddcb4097134ff3c332f xmlns="27c1adeb-3674-457c-b08c-8a73f31b6e23">
+      <Terms xmlns="http://schemas.microsoft.com/office/infopath/2007/PartnerControls"/>
+    </lcf76f155ced4ddcb4097134ff3c332f>
+    <_Flow_SignoffStatus xmlns="27c1adeb-3674-457c-b08c-8a73f31b6e23" xsi:nil="true"/>
+  </documentManagement>
+</p:properties>
 </file>
 
 <file path=customXml/item3.xml><?xml version="1.0" encoding="utf-8"?>
@@ -9046,15 +9109,12 @@
 </file>
 
 <file path=customXml/item4.xml><?xml version="1.0" encoding="utf-8"?>
-<p:properties xmlns:p="http://schemas.microsoft.com/office/2006/metadata/properties" xmlns:xsi="http://www.w3.org/2001/XMLSchema-instance" xmlns:pc="http://schemas.microsoft.com/office/infopath/2007/PartnerControls">
-  <documentManagement>
-    <TaxCatchAll xmlns="0a70e875-3d35-4be2-921f-7117c31bab9b" xsi:nil="true"/>
-    <lcf76f155ced4ddcb4097134ff3c332f xmlns="27c1adeb-3674-457c-b08c-8a73f31b6e23">
-      <Terms xmlns="http://schemas.microsoft.com/office/infopath/2007/PartnerControls"/>
-    </lcf76f155ced4ddcb4097134ff3c332f>
-    <_Flow_SignoffStatus xmlns="27c1adeb-3674-457c-b08c-8a73f31b6e23" xsi:nil="true"/>
-  </documentManagement>
-</p:properties>
+<?mso-contentType ?>
+<FormTemplates xmlns="http://schemas.microsoft.com/sharepoint/v3/contenttype/forms">
+  <Display>DocumentLibraryForm</Display>
+  <Edit>DocumentLibraryForm</Edit>
+  <New>DocumentLibraryForm</New>
+</FormTemplates>
 </file>
 
 <file path=customXml/itemProps1.xml><?xml version="1.0" encoding="utf-8"?>
@@ -9066,9 +9126,12 @@
 </file>
 
 <file path=customXml/itemProps2.xml><?xml version="1.0" encoding="utf-8"?>
-<ds:datastoreItem xmlns:ds="http://schemas.openxmlformats.org/officeDocument/2006/customXml" ds:itemID="{5B3F4A43-888D-4D33-BD1C-7066736CDCB4}">
+<ds:datastoreItem xmlns:ds="http://schemas.openxmlformats.org/officeDocument/2006/customXml" ds:itemID="{1F3C1B10-EE25-478F-A378-26280E5A2662}">
   <ds:schemaRefs>
-    <ds:schemaRef ds:uri="http://schemas.microsoft.com/sharepoint/v3/contenttype/forms"/>
+    <ds:schemaRef ds:uri="http://schemas.microsoft.com/office/2006/metadata/properties"/>
+    <ds:schemaRef ds:uri="http://schemas.microsoft.com/office/infopath/2007/PartnerControls"/>
+    <ds:schemaRef ds:uri="0a70e875-3d35-4be2-921f-7117c31bab9b"/>
+    <ds:schemaRef ds:uri="27c1adeb-3674-457c-b08c-8a73f31b6e23"/>
   </ds:schemaRefs>
 </ds:datastoreItem>
 </file>
@@ -9093,12 +9156,9 @@
 </file>
 
 <file path=customXml/itemProps4.xml><?xml version="1.0" encoding="utf-8"?>
-<ds:datastoreItem xmlns:ds="http://schemas.openxmlformats.org/officeDocument/2006/customXml" ds:itemID="{1F3C1B10-EE25-478F-A378-26280E5A2662}">
+<ds:datastoreItem xmlns:ds="http://schemas.openxmlformats.org/officeDocument/2006/customXml" ds:itemID="{5B3F4A43-888D-4D33-BD1C-7066736CDCB4}">
   <ds:schemaRefs>
-    <ds:schemaRef ds:uri="http://schemas.microsoft.com/office/2006/metadata/properties"/>
-    <ds:schemaRef ds:uri="http://schemas.microsoft.com/office/infopath/2007/PartnerControls"/>
-    <ds:schemaRef ds:uri="0a70e875-3d35-4be2-921f-7117c31bab9b"/>
-    <ds:schemaRef ds:uri="27c1adeb-3674-457c-b08c-8a73f31b6e23"/>
+    <ds:schemaRef ds:uri="http://schemas.microsoft.com/sharepoint/v3/contenttype/forms"/>
   </ds:schemaRefs>
 </ds:datastoreItem>
 </file>
</xml_diff>